<commit_message>
docs(pre-sso): align Ukrainian requirements and role matrix
</commit_message>
<xml_diff>
--- a/ТЗ Кампус МАУП.docx
+++ b/ТЗ Кампус МАУП.docx
@@ -226,87 +226,7 @@
         </w:rPr>
       </w:pPr>
       <w:r>
-        <w:rPr>
-          <w:rFonts w:ascii="Times New Roman" w:cs="Times New Roman" w:eastAsia="Times New Roman" w:hAnsi="Times New Roman"/>
-          <w:color w:val="000000"/>
-          <w:sz w:val="28"/>
-          <w:szCs w:val="28"/>
-          <w:rtl w:val="0"/>
-        </w:rPr>
-        <w:t xml:space="preserve">Система забезпечує підтримку навчального процесу </w:t>
-      </w:r>
-      <w:r>
-        <w:rPr>
-          <w:rFonts w:ascii="Times New Roman" w:cs="Times New Roman" w:eastAsia="Times New Roman" w:hAnsi="Times New Roman"/>
-          <w:sz w:val="28"/>
-          <w:szCs w:val="28"/>
-          <w:rtl w:val="0"/>
-        </w:rPr>
-        <w:t xml:space="preserve">у </w:t>
-      </w:r>
-      <w:r>
-        <w:rPr>
-          <w:rFonts w:ascii="Times New Roman" w:cs="Times New Roman" w:eastAsia="Times New Roman" w:hAnsi="Times New Roman"/>
-          <w:color w:val="000000"/>
-          <w:sz w:val="28"/>
-          <w:szCs w:val="28"/>
-          <w:rtl w:val="0"/>
-        </w:rPr>
-        <w:t xml:space="preserve">МАУП шляхом надання веб-доступу до розкладу занять, навчальних матеріалів, завдань, результатів навчання та сервісів комунікації для студентів, викладачів, диспетчерів розкладу, завідувачів кафедр, декана факультету, ректора, президента </w:t>
-      </w:r>
-      <w:r>
-        <w:rPr>
-          <w:rFonts w:ascii="Times New Roman" w:cs="Times New Roman" w:eastAsia="Times New Roman" w:hAnsi="Times New Roman"/>
-          <w:sz w:val="28"/>
-          <w:szCs w:val="28"/>
-          <w:rtl w:val="0"/>
-        </w:rPr>
-        <w:t xml:space="preserve">А</w:t>
-      </w:r>
-      <w:r>
-        <w:rPr>
-          <w:rFonts w:ascii="Times New Roman" w:cs="Times New Roman" w:eastAsia="Times New Roman" w:hAnsi="Times New Roman"/>
-          <w:color w:val="000000"/>
-          <w:sz w:val="28"/>
-          <w:szCs w:val="28"/>
-          <w:rtl w:val="0"/>
-        </w:rPr>
-        <w:t xml:space="preserve">кадемії.</w:t>
-      </w:r>
-      <w:bookmarkStart w:colFirst="0" w:colLast="0" w:name="8x4gi6qcjc6q" w:id="5"/>
-      <w:bookmarkEnd w:id="5"/>
-      <w:hyperlink w:anchor="shi4z2cblx1z">
-        <w:r>
-          <w:rPr>
-            <w:rFonts w:ascii="Times New Roman" w:cs="Times New Roman" w:eastAsia="Times New Roman" w:hAnsi="Times New Roman"/>
-            <w:sz w:val="28"/>
-            <w:szCs w:val="28"/>
-            <w:u w:val="single"/>
-            <w:vertAlign w:val="superscript"/>
-            <w:rtl w:val="0"/>
-          </w:rPr>
-          <w:t xml:space="preserve">[4]</w:t>
-        </w:r>
-      </w:hyperlink>
-      <w:bookmarkStart w:colFirst="0" w:colLast="0" w:name="vygalug1214m" w:id="6"/>
-      <w:bookmarkEnd w:id="6"/>
-      <w:hyperlink w:anchor="y1hfcf78b486">
-        <w:r>
-          <w:rPr>
-            <w:rFonts w:ascii="Times New Roman" w:cs="Times New Roman" w:eastAsia="Times New Roman" w:hAnsi="Times New Roman"/>
-            <w:sz w:val="28"/>
-            <w:szCs w:val="28"/>
-            <w:u w:val="single"/>
-            <w:vertAlign w:val="superscript"/>
-            <w:rtl w:val="0"/>
-          </w:rPr>
-          <w:t xml:space="preserve">[5]</w:t>
-        </w:r>
-      </w:hyperlink>
-      <w:r>
-        <w:rPr>
-          <w:rtl w:val="0"/>
-        </w:rPr>
+        <w:t>Система забезпечує підтримку навчального процесу у МАУП шляхом надання веб-доступу до розкладу занять, навчальних матеріалів, завдань, результатів навчання та сервісів комунікації для студентів, викладачів, завідувачів кафедр, декана факультету, ректора, президента Академії.[4][5]</w:t>
       </w:r>
     </w:p>
     <w:p>
@@ -357,38 +277,7 @@
         </w:rPr>
       </w:pPr>
       <w:r>
-        <w:rPr>
-          <w:rFonts w:ascii="Times New Roman" w:cs="Times New Roman" w:eastAsia="Times New Roman" w:hAnsi="Times New Roman"/>
-          <w:color w:val="000000"/>
-          <w:sz w:val="28"/>
-          <w:szCs w:val="28"/>
-          <w:rtl w:val="0"/>
-        </w:rPr>
-        <w:t xml:space="preserve">особисті кабінети студентів, викладачів, диспетчерів розкладу, завідувачів кафедр, декана факультету, ректо</w:t>
-      </w:r>
-      <w:r>
-        <w:rPr>
-          <w:rFonts w:ascii="Times New Roman" w:cs="Times New Roman" w:eastAsia="Times New Roman" w:hAnsi="Times New Roman"/>
-          <w:sz w:val="28"/>
-          <w:szCs w:val="28"/>
-          <w:rtl w:val="0"/>
-        </w:rPr>
-        <w:t xml:space="preserve">ра, президента академії</w:t>
-      </w:r>
-      <w:r>
-        <w:rPr>
-          <w:rFonts w:ascii="Times New Roman" w:cs="Times New Roman" w:eastAsia="Times New Roman" w:hAnsi="Times New Roman"/>
-          <w:color w:val="000000"/>
-          <w:sz w:val="28"/>
-          <w:szCs w:val="28"/>
-          <w:rtl w:val="0"/>
-        </w:rPr>
-        <w:t xml:space="preserve">;</w:t>
-      </w:r>
-      <w:r>
-        <w:rPr>
-          <w:rtl w:val="0"/>
-        </w:rPr>
+        <w:t>особисті кабінети студентів, викладачів, завідувачів кафедр, декана факультету, ректора, президента академії;</w:t>
       </w:r>
     </w:p>
     <w:p>
@@ -695,68 +584,7 @@
         </w:rPr>
       </w:pPr>
       <w:r>
-        <w:rPr>
-          <w:rFonts w:ascii="Times New Roman" w:cs="Times New Roman" w:eastAsia="Times New Roman" w:hAnsi="Times New Roman"/>
-          <w:color w:val="000000"/>
-          <w:sz w:val="28"/>
-          <w:szCs w:val="28"/>
-          <w:rtl w:val="0"/>
-        </w:rPr>
-        <w:t xml:space="preserve">Студент, Викладач, Диспетчер розкладу, Завідувач кафедри, Декан факультету, Ректор, Пр</w:t>
-      </w:r>
-      <w:r>
-        <w:rPr>
-          <w:rFonts w:ascii="Times New Roman" w:cs="Times New Roman" w:eastAsia="Times New Roman" w:hAnsi="Times New Roman"/>
-          <w:sz w:val="28"/>
-          <w:szCs w:val="28"/>
-          <w:rtl w:val="0"/>
-        </w:rPr>
-        <w:t xml:space="preserve">езидент академії, </w:t>
-      </w:r>
-      <w:r>
-        <w:rPr>
-          <w:rFonts w:ascii="Times New Roman" w:cs="Times New Roman" w:eastAsia="Times New Roman" w:hAnsi="Times New Roman"/>
-          <w:color w:val="000000"/>
-          <w:sz w:val="28"/>
-          <w:szCs w:val="28"/>
-          <w:rtl w:val="0"/>
-        </w:rPr>
-        <w:t xml:space="preserve">Адміністратор – ролі користувачів у системі.</w:t>
-      </w:r>
-      <w:bookmarkStart w:colFirst="0" w:colLast="0" w:name="tu0iikwcdeoh" w:id="11"/>
-      <w:bookmarkEnd w:id="11"/>
-      <w:hyperlink w:anchor="92x5d0gxdjqs">
-        <w:r>
-          <w:rPr>
-            <w:rFonts w:ascii="Times New Roman" w:cs="Times New Roman" w:eastAsia="Times New Roman" w:hAnsi="Times New Roman"/>
-            <w:sz w:val="28"/>
-            <w:szCs w:val="28"/>
-            <w:u w:val="single"/>
-            <w:vertAlign w:val="superscript"/>
-            <w:rtl w:val="0"/>
-          </w:rPr>
-          <w:t xml:space="preserve">[6]</w:t>
-        </w:r>
-      </w:hyperlink>
-      <w:bookmarkStart w:colFirst="0" w:colLast="0" w:name="u2buyuak831j" w:id="12"/>
-      <w:bookmarkEnd w:id="12"/>
-      <w:hyperlink w:anchor="7bi0yy2bl99">
-        <w:r>
-          <w:rPr>
-            <w:rFonts w:ascii="Times New Roman" w:cs="Times New Roman" w:eastAsia="Times New Roman" w:hAnsi="Times New Roman"/>
-            <w:sz w:val="28"/>
-            <w:szCs w:val="28"/>
-            <w:u w:val="single"/>
-            <w:vertAlign w:val="superscript"/>
-            <w:rtl w:val="0"/>
-          </w:rPr>
-          <w:t xml:space="preserve">[3]</w:t>
-        </w:r>
-      </w:hyperlink>
-      <w:r>
-        <w:rPr>
-          <w:rtl w:val="0"/>
-        </w:rPr>
+        <w:t>Студент, Викладач, Завідувач кафедри, Декан факультету, Ректор, Президент академії, Адміністратор – ролі користувачів у системі.[6][3]</w:t>
       </w:r>
     </w:p>
     <w:bookmarkStart w:colFirst="0" w:colLast="0" w:name="sfzlojlf6k3q" w:id="13"/>
@@ -1859,69 +1687,6 @@
           <w:szCs w:val="28"/>
           <w:rtl w:val="0"/>
         </w:rPr>
-        <w:t xml:space="preserve">Диспетчери розкладу: адміністративний персонал, відповідає за формування розкладу.</w:t>
-      </w:r>
-      <w:bookmarkStart w:colFirst="0" w:colLast="0" w:name="7vpeljjb2qf" w:id="36"/>
-      <w:bookmarkEnd w:id="36"/>
-      <w:hyperlink w:anchor="y1hfcf78b486">
-        <w:r>
-          <w:rPr>
-            <w:rFonts w:ascii="Times New Roman" w:cs="Times New Roman" w:eastAsia="Times New Roman" w:hAnsi="Times New Roman"/>
-            <w:sz w:val="28"/>
-            <w:szCs w:val="28"/>
-            <w:u w:val="single"/>
-            <w:vertAlign w:val="superscript"/>
-            <w:rtl w:val="0"/>
-          </w:rPr>
-          <w:t xml:space="preserve">[5]</w:t>
-        </w:r>
-      </w:hyperlink>
-      <w:bookmarkStart w:colFirst="0" w:colLast="0" w:name="p40o11qd6ipi" w:id="37"/>
-      <w:bookmarkEnd w:id="37"/>
-      <w:hyperlink w:anchor="7bi0yy2bl99">
-        <w:r>
-          <w:rPr>
-            <w:rFonts w:ascii="Times New Roman" w:cs="Times New Roman" w:eastAsia="Times New Roman" w:hAnsi="Times New Roman"/>
-            <w:sz w:val="28"/>
-            <w:szCs w:val="28"/>
-            <w:u w:val="single"/>
-            <w:vertAlign w:val="superscript"/>
-            <w:rtl w:val="0"/>
-          </w:rPr>
-          <w:t xml:space="preserve">[3]</w:t>
-        </w:r>
-      </w:hyperlink>
-      <w:r>
-        <w:rPr>
-          <w:rtl w:val="0"/>
-        </w:rPr>
-      </w:r>
-    </w:p>
-    <w:p>
-      <w:pPr>
-        <w:numPr>
-          <w:ilvl w:val="0"/>
-          <w:numId w:val="10"/>
-        </w:numPr>
-        <w:tabs>
-          <w:tab w:val="left" w:leader="none" w:pos="1134"/>
-        </w:tabs>
-        <w:spacing w:after="0" w:line="240" w:lineRule="auto"/>
-        <w:ind w:left="-30" w:firstLine="597"/>
-        <w:jc w:val="both"/>
-        <w:rPr>
-          <w:sz w:val="28"/>
-          <w:szCs w:val="28"/>
-        </w:rPr>
-      </w:pPr>
-      <w:r>
-        <w:rPr>
-          <w:rFonts w:ascii="Times New Roman" w:cs="Times New Roman" w:eastAsia="Times New Roman" w:hAnsi="Times New Roman"/>
-          <w:color w:val="000000"/>
-          <w:sz w:val="28"/>
-          <w:szCs w:val="28"/>
-          <w:rtl w:val="0"/>
-        </w:rPr>
         <w:t xml:space="preserve">Адміністратори: IT-персонал, відповідає за користувачів, ролі, інтеграції, підтримку.</w:t>
       </w:r>
       <w:bookmarkStart w:colFirst="0" w:colLast="0" w:name="ms85r5g7at4w" w:id="38"/>
@@ -2069,23 +1834,7 @@
         </w:rPr>
       </w:pPr>
       <w:r>
-        <w:rPr>
-          <w:rFonts w:ascii="Times New Roman" w:cs="Times New Roman" w:eastAsia="Times New Roman" w:hAnsi="Times New Roman"/>
-          <w:color w:val="000000"/>
-          <w:sz w:val="28"/>
-          <w:szCs w:val="28"/>
-          <w:rtl w:val="0"/>
-        </w:rPr>
-        <w:t xml:space="preserve">Ректор: кері</w:t>
-      </w:r>
-      <w:r>
-        <w:rPr>
-          <w:rFonts w:ascii="Times New Roman" w:cs="Times New Roman" w:eastAsia="Times New Roman" w:hAnsi="Times New Roman"/>
-          <w:sz w:val="28"/>
-          <w:szCs w:val="28"/>
-          <w:rtl w:val="0"/>
-        </w:rPr>
-        <w:t xml:space="preserve">вник академії, відповідає за загальний контроль процесів академії та схвалення документації, формування звітів.</w:t>
+        <w:t>Ректор: керівник академії, має read-only доступ до загальних звітів і результатів контролю; не керує користувачами та не виконує операційні зміни.</w:t>
       </w:r>
     </w:p>
     <w:p>
@@ -2103,57 +1852,7 @@
         </w:rPr>
       </w:pPr>
       <w:r>
-        <w:rPr>
-          <w:rFonts w:ascii="Times New Roman" w:cs="Times New Roman" w:eastAsia="Times New Roman" w:hAnsi="Times New Roman"/>
-          <w:sz w:val="28"/>
-          <w:szCs w:val="28"/>
-          <w:rtl w:val="0"/>
-        </w:rPr>
-        <w:t xml:space="preserve">Президент академії: власник академії, доступ до всієї інформації.</w:t>
-      </w:r>
-      <w:hyperlink w:anchor="92x5d0gxdjqs">
-        <w:r>
-          <w:rPr>
-            <w:rFonts w:ascii="Times New Roman" w:cs="Times New Roman" w:eastAsia="Times New Roman" w:hAnsi="Times New Roman"/>
-            <w:sz w:val="28"/>
-            <w:szCs w:val="28"/>
-            <w:u w:val="single"/>
-            <w:vertAlign w:val="superscript"/>
-            <w:rtl w:val="0"/>
-          </w:rPr>
-          <w:t xml:space="preserve">[29]</w:t>
-        </w:r>
-      </w:hyperlink>
-      <w:hyperlink w:anchor="7bi0yy2bl99">
-        <w:r>
-          <w:rPr>
-            <w:rFonts w:ascii="Times New Roman" w:cs="Times New Roman" w:eastAsia="Times New Roman" w:hAnsi="Times New Roman"/>
-            <w:sz w:val="28"/>
-            <w:szCs w:val="28"/>
-            <w:u w:val="single"/>
-            <w:vertAlign w:val="superscript"/>
-            <w:rtl w:val="0"/>
-          </w:rPr>
-          <w:t xml:space="preserve">[26]</w:t>
-        </w:r>
-      </w:hyperlink>
-      <w:hyperlink w:anchor="dyx2xar0adjf">
-        <w:r>
-          <w:rPr>
-            <w:rFonts w:ascii="Times New Roman" w:cs="Times New Roman" w:eastAsia="Times New Roman" w:hAnsi="Times New Roman"/>
-            <w:sz w:val="28"/>
-            <w:szCs w:val="28"/>
-            <w:u w:val="single"/>
-            <w:vertAlign w:val="superscript"/>
-            <w:rtl w:val="0"/>
-          </w:rPr>
-          <w:t xml:space="preserve">[24]</w:t>
-        </w:r>
-      </w:hyperlink>
-      <w:r>
-        <w:rPr>
-          <w:rtl w:val="0"/>
-        </w:rPr>
+        <w:t>Президент академії: власник академії, має read-only доступ до загальних звітів і пошуку інформації про студентів.[29][26][24]</w:t>
       </w:r>
     </w:p>
     <w:bookmarkStart w:colFirst="0" w:colLast="0" w:name="p7rtvkwn8oa2" w:id="40"/>
@@ -2845,68 +2544,7 @@
         </w:rPr>
       </w:pPr>
       <w:r>
-        <w:rPr>
-          <w:rFonts w:ascii="Times New Roman" w:cs="Times New Roman" w:eastAsia="Times New Roman" w:hAnsi="Times New Roman"/>
-          <w:color w:val="000000"/>
-          <w:sz w:val="28"/>
-          <w:szCs w:val="28"/>
-          <w:rtl w:val="0"/>
-        </w:rPr>
-        <w:t xml:space="preserve">FR-2: Система повинна підтримувати рольову модель доступу (RBAC) з ролями: Студент, Викладач, Диспетчер розкладу, Завідувач кафедри, Декан факультету, Ректор, Президент академії</w:t>
-      </w:r>
-      <w:r>
-        <w:rPr>
-          <w:rFonts w:ascii="Times New Roman" w:cs="Times New Roman" w:eastAsia="Times New Roman" w:hAnsi="Times New Roman"/>
-          <w:sz w:val="28"/>
-          <w:szCs w:val="28"/>
-          <w:rtl w:val="0"/>
-        </w:rPr>
-        <w:t xml:space="preserve">, </w:t>
-      </w:r>
-      <w:r>
-        <w:rPr>
-          <w:rFonts w:ascii="Times New Roman" w:cs="Times New Roman" w:eastAsia="Times New Roman" w:hAnsi="Times New Roman"/>
-          <w:color w:val="000000"/>
-          <w:sz w:val="28"/>
-          <w:szCs w:val="28"/>
-          <w:rtl w:val="0"/>
-        </w:rPr>
-        <w:t xml:space="preserve">Адміністратор.</w:t>
-      </w:r>
-      <w:bookmarkStart w:colFirst="0" w:colLast="0" w:name="z8jb6yr26ng8" w:id="57"/>
-      <w:bookmarkEnd w:id="57"/>
-      <w:hyperlink w:anchor="vajevp9wetgg">
-        <w:r>
-          <w:rPr>
-            <w:rFonts w:ascii="Times New Roman" w:cs="Times New Roman" w:eastAsia="Times New Roman" w:hAnsi="Times New Roman"/>
-            <w:sz w:val="28"/>
-            <w:szCs w:val="28"/>
-            <w:u w:val="single"/>
-            <w:vertAlign w:val="superscript"/>
-            <w:rtl w:val="0"/>
-          </w:rPr>
-          <w:t xml:space="preserve">[16]</w:t>
-        </w:r>
-      </w:hyperlink>
-      <w:bookmarkStart w:colFirst="0" w:colLast="0" w:name="jk9tjrg2b83w" w:id="58"/>
-      <w:bookmarkEnd w:id="58"/>
-      <w:hyperlink w:anchor="uxjb5xiqdk4m">
-        <w:r>
-          <w:rPr>
-            <w:rFonts w:ascii="Times New Roman" w:cs="Times New Roman" w:eastAsia="Times New Roman" w:hAnsi="Times New Roman"/>
-            <w:sz w:val="28"/>
-            <w:szCs w:val="28"/>
-            <w:u w:val="single"/>
-            <w:vertAlign w:val="superscript"/>
-            <w:rtl w:val="0"/>
-          </w:rPr>
-          <w:t xml:space="preserve">[13]</w:t>
-        </w:r>
-      </w:hyperlink>
-      <w:r>
-        <w:rPr>
-          <w:rtl w:val="0"/>
-        </w:rPr>
+        <w:t>FR-2: Система повинна підтримувати рольову модель доступу (RBAC) з ролями: Студент, Викладач, Завідувач кафедри, Декан факультету, Ректор, Президент академії, Адміністратор.[16][13]</w:t>
       </w:r>
     </w:p>
     <w:p>
@@ -3347,49 +2985,7 @@
         </w:rPr>
       </w:pPr>
       <w:r>
-        <w:rPr>
-          <w:rFonts w:ascii="Times New Roman" w:cs="Times New Roman" w:eastAsia="Times New Roman" w:hAnsi="Times New Roman"/>
-          <w:color w:val="000000"/>
-          <w:sz w:val="28"/>
-          <w:szCs w:val="28"/>
-          <w:rtl w:val="0"/>
-        </w:rPr>
-        <w:t xml:space="preserve">FR-14: Студент повинен отримувати сповіщення про нові завдання, зміни розкладу, оголошення.</w:t>
-      </w:r>
-      <w:bookmarkStart w:colFirst="0" w:colLast="0" w:name="clcc4mmrdq72" w:id="71"/>
-      <w:bookmarkEnd w:id="71"/>
-      <w:hyperlink w:anchor="shi4z2cblx1z">
-        <w:r>
-          <w:rPr>
-            <w:rFonts w:ascii="Times New Roman" w:cs="Times New Roman" w:eastAsia="Times New Roman" w:hAnsi="Times New Roman"/>
-            <w:sz w:val="28"/>
-            <w:szCs w:val="28"/>
-            <w:u w:val="single"/>
-            <w:vertAlign w:val="superscript"/>
-            <w:rtl w:val="0"/>
-          </w:rPr>
-          <w:t xml:space="preserve">[4]</w:t>
-        </w:r>
-      </w:hyperlink>
-      <w:bookmarkStart w:colFirst="0" w:colLast="0" w:name="ykx15wsjqtsn" w:id="72"/>
-      <w:bookmarkEnd w:id="72"/>
-      <w:hyperlink w:anchor="y1hfcf78b486">
-        <w:r>
-          <w:rPr>
-            <w:rFonts w:ascii="Times New Roman" w:cs="Times New Roman" w:eastAsia="Times New Roman" w:hAnsi="Times New Roman"/>
-            <w:sz w:val="28"/>
-            <w:szCs w:val="28"/>
-            <w:u w:val="single"/>
-            <w:vertAlign w:val="superscript"/>
-            <w:rtl w:val="0"/>
-          </w:rPr>
-          <w:t xml:space="preserve">[5]</w:t>
-        </w:r>
-      </w:hyperlink>
-      <w:r>
-        <w:rPr>
-          <w:rtl w:val="0"/>
-        </w:rPr>
+        <w:t>FR-14: Студент повинен отримувати сповіщення про нові завдання, зміни розкладу, оголошення.[4][5] Розділ сповіщень повинен дозволяти пошук і фільтрування за станом прочитання, типом та важливістю; адміністратор додатково фільтрує за аудиторією. Розділ сповіщень повинен дозволяти пошук і фільтрування за станом прочитання, типом та важливістю; адміністратор додатково фільтрує за аудиторією.</w:t>
       </w:r>
     </w:p>
     <w:p>
@@ -3957,21 +3553,7 @@
         </w:rPr>
       </w:pPr>
       <w:r>
-        <w:rPr>
-          <w:rFonts w:ascii="Times New Roman" w:cs="Times New Roman" w:eastAsia="Times New Roman" w:hAnsi="Times New Roman"/>
-          <w:b w:val="1"/>
-          <w:bCs w:val="1"/>
-          <w:color w:val="000000"/>
-          <w:sz w:val="28"/>
-          <w:szCs w:val="28"/>
-          <w:rtl w:val="0"/>
-        </w:rPr>
-        <w:t xml:space="preserve">3.4. Кабінет диспетчера розкладу</w:t>
-      </w:r>
-      <w:r>
-        <w:rPr>
-          <w:rtl w:val="0"/>
-        </w:rPr>
+        <w:t>3.4. Керування розкладом адміністратором</w:t>
       </w:r>
     </w:p>
     <w:p>
@@ -3992,49 +3574,7 @@
         </w:rPr>
       </w:pPr>
       <w:r>
-        <w:rPr>
-          <w:rFonts w:ascii="Times New Roman" w:cs="Times New Roman" w:eastAsia="Times New Roman" w:hAnsi="Times New Roman"/>
-          <w:color w:val="000000"/>
-          <w:sz w:val="28"/>
-          <w:szCs w:val="28"/>
-          <w:rtl w:val="0"/>
-        </w:rPr>
-        <w:t xml:space="preserve">FR-30: Диспетчер повинен мати можливість створювати та редагувати розклад занять (дата, час, дисципліна, викладач, аудиторія чи онлайн, тип заняття).</w:t>
-      </w:r>
-      <w:bookmarkStart w:colFirst="0" w:colLast="0" w:name="1w1rw1r8a4xk" w:id="89"/>
-      <w:bookmarkEnd w:id="89"/>
-      <w:hyperlink w:anchor="7bi0yy2bl99">
-        <w:r>
-          <w:rPr>
-            <w:rFonts w:ascii="Times New Roman" w:cs="Times New Roman" w:eastAsia="Times New Roman" w:hAnsi="Times New Roman"/>
-            <w:sz w:val="28"/>
-            <w:szCs w:val="28"/>
-            <w:u w:val="single"/>
-            <w:vertAlign w:val="superscript"/>
-            <w:rtl w:val="0"/>
-          </w:rPr>
-          <w:t xml:space="preserve">[3]</w:t>
-        </w:r>
-      </w:hyperlink>
-      <w:bookmarkStart w:colFirst="0" w:colLast="0" w:name="2eikdirkce88" w:id="90"/>
-      <w:bookmarkEnd w:id="90"/>
-      <w:hyperlink w:anchor="y1hfcf78b486">
-        <w:r>
-          <w:rPr>
-            <w:rFonts w:ascii="Times New Roman" w:cs="Times New Roman" w:eastAsia="Times New Roman" w:hAnsi="Times New Roman"/>
-            <w:sz w:val="28"/>
-            <w:szCs w:val="28"/>
-            <w:u w:val="single"/>
-            <w:vertAlign w:val="superscript"/>
-            <w:rtl w:val="0"/>
-          </w:rPr>
-          <w:t xml:space="preserve">[5]</w:t>
-        </w:r>
-      </w:hyperlink>
-      <w:r>
-        <w:rPr>
-          <w:rtl w:val="0"/>
-        </w:rPr>
+        <w:t>FR-30: Адміністратор повинен мати можливість створювати та редагувати розклад занять (дата, час, дисципліна, викладач, аудиторія чи онлайн, тип заняття).[3][5]</w:t>
       </w:r>
     </w:p>
     <w:p>
@@ -4103,34 +3643,7 @@
         </w:rPr>
       </w:pPr>
       <w:r>
-        <w:rPr>
-          <w:rFonts w:ascii="Times New Roman" w:cs="Times New Roman" w:eastAsia="Times New Roman" w:hAnsi="Times New Roman"/>
-          <w:color w:val="000000"/>
-          <w:sz w:val="28"/>
-          <w:szCs w:val="28"/>
-          <w:rtl w:val="0"/>
-        </w:rPr>
-        <w:t xml:space="preserve">FR-32: Диспетчер повинен мати можливість проводити масові операції над розкладом (копіювання, шаблони тижнів, разові зміни).</w:t>
-      </w:r>
-      <w:bookmarkStart w:colFirst="0" w:colLast="0" w:name="9b9m2q23jjpu" w:id="92"/>
-      <w:bookmarkEnd w:id="92"/>
-      <w:hyperlink w:anchor="y1hfcf78b486">
-        <w:r>
-          <w:rPr>
-            <w:rFonts w:ascii="Times New Roman" w:cs="Times New Roman" w:eastAsia="Times New Roman" w:hAnsi="Times New Roman"/>
-            <w:sz w:val="28"/>
-            <w:szCs w:val="28"/>
-            <w:u w:val="single"/>
-            <w:vertAlign w:val="superscript"/>
-            <w:rtl w:val="0"/>
-          </w:rPr>
-          <w:t xml:space="preserve">[5]</w:t>
-        </w:r>
-      </w:hyperlink>
-      <w:r>
-        <w:rPr>
-          <w:rtl w:val="0"/>
-        </w:rPr>
+        <w:t>FR-32: Адміністратор повинен мати можливість проводити масові операції над розкладом (копіювання, шаблони тижнів, разові зміни).[5]</w:t>
       </w:r>
     </w:p>
     <w:p>
@@ -4151,49 +3664,7 @@
         </w:rPr>
       </w:pPr>
       <w:r>
-        <w:rPr>
-          <w:rFonts w:ascii="Times New Roman" w:cs="Times New Roman" w:eastAsia="Times New Roman" w:hAnsi="Times New Roman"/>
-          <w:color w:val="000000"/>
-          <w:sz w:val="28"/>
-          <w:szCs w:val="28"/>
-          <w:rtl w:val="0"/>
-        </w:rPr>
-        <w:t xml:space="preserve">FR-33: Диспетчер повинен мати можливість позначати заміни/перенесення/скасування занять із автоматичною генерацією сповіщень та зміною розкладу у кабінеті викладача та студента.</w:t>
-      </w:r>
-      <w:bookmarkStart w:colFirst="0" w:colLast="0" w:name="p8g4wfnf5kbt" w:id="93"/>
-      <w:bookmarkEnd w:id="93"/>
-      <w:hyperlink w:anchor="7bi0yy2bl99">
-        <w:r>
-          <w:rPr>
-            <w:rFonts w:ascii="Times New Roman" w:cs="Times New Roman" w:eastAsia="Times New Roman" w:hAnsi="Times New Roman"/>
-            <w:sz w:val="28"/>
-            <w:szCs w:val="28"/>
-            <w:u w:val="single"/>
-            <w:vertAlign w:val="superscript"/>
-            <w:rtl w:val="0"/>
-          </w:rPr>
-          <w:t xml:space="preserve">[3]</w:t>
-        </w:r>
-      </w:hyperlink>
-      <w:bookmarkStart w:colFirst="0" w:colLast="0" w:name="kpumf2gyl9az" w:id="94"/>
-      <w:bookmarkEnd w:id="94"/>
-      <w:hyperlink w:anchor="y1hfcf78b486">
-        <w:r>
-          <w:rPr>
-            <w:rFonts w:ascii="Times New Roman" w:cs="Times New Roman" w:eastAsia="Times New Roman" w:hAnsi="Times New Roman"/>
-            <w:sz w:val="28"/>
-            <w:szCs w:val="28"/>
-            <w:u w:val="single"/>
-            <w:vertAlign w:val="superscript"/>
-            <w:rtl w:val="0"/>
-          </w:rPr>
-          <w:t xml:space="preserve">[5]</w:t>
-        </w:r>
-      </w:hyperlink>
-      <w:r>
-        <w:rPr>
-          <w:rtl w:val="0"/>
-        </w:rPr>
+        <w:t>FR-33: Адміністратор повинен мати можливість позначати заміни/перенесення/скасування занять із автоматичною генерацією сповіщень та зміною розкладу у кабінеті викладача та студента.[3][5]</w:t>
       </w:r>
     </w:p>
     <w:p>
@@ -4214,34 +3685,7 @@
         </w:rPr>
       </w:pPr>
       <w:r>
-        <w:rPr>
-          <w:rFonts w:ascii="Times New Roman" w:cs="Times New Roman" w:eastAsia="Times New Roman" w:hAnsi="Times New Roman"/>
-          <w:color w:val="000000"/>
-          <w:sz w:val="28"/>
-          <w:szCs w:val="28"/>
-          <w:rtl w:val="0"/>
-        </w:rPr>
-        <w:t xml:space="preserve">FR-34: Диспетчер повинен мати можливість експортувати розклад по групі, викладачу, аудиторії.</w:t>
-      </w:r>
-      <w:bookmarkStart w:colFirst="0" w:colLast="0" w:name="dfyinp53g68k" w:id="95"/>
-      <w:bookmarkEnd w:id="95"/>
-      <w:hyperlink w:anchor="y1hfcf78b486">
-        <w:r>
-          <w:rPr>
-            <w:rFonts w:ascii="Times New Roman" w:cs="Times New Roman" w:eastAsia="Times New Roman" w:hAnsi="Times New Roman"/>
-            <w:sz w:val="28"/>
-            <w:szCs w:val="28"/>
-            <w:u w:val="single"/>
-            <w:vertAlign w:val="superscript"/>
-            <w:rtl w:val="0"/>
-          </w:rPr>
-          <w:t xml:space="preserve">[5]</w:t>
-        </w:r>
-      </w:hyperlink>
-      <w:r>
-        <w:rPr>
-          <w:rtl w:val="0"/>
-        </w:rPr>
+        <w:t>FR-34: Адміністратор повинен мати можливість експортувати розклад по групі, викладачу, аудиторії.[5]</w:t>
       </w:r>
     </w:p>
     <w:p>
@@ -4263,12 +3707,7 @@
         </w:rPr>
       </w:pPr>
       <w:r>
-        <w:rPr>
-          <w:sz w:val="28"/>
-          <w:szCs w:val="28"/>
-          <w:rtl w:val="0"/>
-        </w:rPr>
-        <w:t xml:space="preserve">FR-35: Диспетчер повинен мати можливість бачити обрані студентами вибіркові дисципліни.</w:t>
+        <w:t>FR-35: Адміністратор повинен мати можливість бачити обрані студентами вибіркові дисципліни.</w:t>
       </w:r>
     </w:p>
     <w:bookmarkStart w:colFirst="0" w:colLast="0" w:name="sn0ylzif8yyz" w:id="96"/>
@@ -4771,13 +4210,7 @@
         </w:rPr>
       </w:pPr>
       <w:r>
-        <w:rPr>
-          <w:rFonts w:ascii="Times New Roman" w:cs="Times New Roman" w:eastAsia="Times New Roman" w:hAnsi="Times New Roman"/>
-          <w:sz w:val="28"/>
-          <w:szCs w:val="28"/>
-          <w:rtl w:val="0"/>
-        </w:rPr>
-        <w:t xml:space="preserve">FR-46: Ректор повинен мати можливість переглядати загальні звіти по факультетам…</w:t>
+        <w:t>FR-46: Ректор повинен мати можливість переглядати загальні звіти по факультетах у режимі read-only без редагування або блокування користувачів.</w:t>
       </w:r>
     </w:p>
     <w:p>
@@ -4798,13 +4231,7 @@
         </w:rPr>
       </w:pPr>
       <w:r>
-        <w:rPr>
-          <w:rFonts w:ascii="Times New Roman" w:cs="Times New Roman" w:eastAsia="Times New Roman" w:hAnsi="Times New Roman"/>
-          <w:sz w:val="28"/>
-          <w:szCs w:val="28"/>
-          <w:rtl w:val="0"/>
-        </w:rPr>
-        <w:t xml:space="preserve">FR-47: Президент академії повинен мати можливість переглядати всю інформацію по студенту за ПІБ.</w:t>
+        <w:t>FR-47: Президент академії повинен мати можливість переглядати інформацію про студента за ПІБ у режимі read-only.</w:t>
       </w:r>
     </w:p>
     <w:p>
@@ -5787,49 +5214,7 @@
         </w:rPr>
       </w:pPr>
       <w:r>
-        <w:rPr>
-          <w:rFonts w:ascii="Times New Roman" w:cs="Times New Roman" w:eastAsia="Times New Roman" w:hAnsi="Times New Roman"/>
-          <w:color w:val="000000"/>
-          <w:sz w:val="28"/>
-          <w:szCs w:val="28"/>
-          <w:rtl w:val="0"/>
-        </w:rPr>
-        <w:t xml:space="preserve">NFR-11: Серверна частина має підтримувати розгортання на стандартному веб-стеку (Linux/Windows, веб-сервер, СУБД).</w:t>
-      </w:r>
-      <w:bookmarkStart w:colFirst="0" w:colLast="0" w:name="jolrstlclis0" w:id="129"/>
-      <w:bookmarkEnd w:id="129"/>
-      <w:hyperlink w:anchor="y1hfcf78b486">
-        <w:r>
-          <w:rPr>
-            <w:rFonts w:ascii="Times New Roman" w:cs="Times New Roman" w:eastAsia="Times New Roman" w:hAnsi="Times New Roman"/>
-            <w:sz w:val="28"/>
-            <w:szCs w:val="28"/>
-            <w:u w:val="single"/>
-            <w:vertAlign w:val="superscript"/>
-            <w:rtl w:val="0"/>
-          </w:rPr>
-          <w:t xml:space="preserve">[5]</w:t>
-        </w:r>
-      </w:hyperlink>
-      <w:bookmarkStart w:colFirst="0" w:colLast="0" w:name="d37l6sip4od3" w:id="130"/>
-      <w:bookmarkEnd w:id="130"/>
-      <w:hyperlink w:anchor="7bi0yy2bl99">
-        <w:r>
-          <w:rPr>
-            <w:rFonts w:ascii="Times New Roman" w:cs="Times New Roman" w:eastAsia="Times New Roman" w:hAnsi="Times New Roman"/>
-            <w:sz w:val="28"/>
-            <w:szCs w:val="28"/>
-            <w:u w:val="single"/>
-            <w:vertAlign w:val="superscript"/>
-            <w:rtl w:val="0"/>
-          </w:rPr>
-          <w:t xml:space="preserve">[3]</w:t>
-        </w:r>
-      </w:hyperlink>
-      <w:r>
-        <w:rPr>
-          <w:rtl w:val="0"/>
-        </w:rPr>
+        <w:t>NFR-11: Серверна частина має підтримувати розгортання на Node.js 24 LTS у стандартному веб-стеку Linux/Windows; дозволяються актуальні security patch-релізи в межах major-версії 24 без прив'язки до одного patch-релізу.[5][3]</w:t>
       </w:r>
     </w:p>
     <w:p>
@@ -5952,58 +5337,7 @@
         </w:rPr>
       </w:pPr>
       <w:r>
-        <w:rPr>
-          <w:rFonts w:ascii="Times New Roman" w:cs="Times New Roman" w:eastAsia="Times New Roman" w:hAnsi="Times New Roman"/>
-          <w:color w:val="000000"/>
-          <w:sz w:val="28"/>
-          <w:szCs w:val="28"/>
-          <w:rtl w:val="0"/>
-        </w:rPr>
-        <w:t xml:space="preserve">Система реалізує RBAC з ієрархією ролей: права вищих ролей включають права нижчих, з мінімальними привілеями (principle of least privilege). Користувач може мати одну основну роль.</w:t>
-      </w:r>
-      <w:hyperlink w:anchor="eckwbfrbvwto">
-        <w:r>
-          <w:rPr>
-            <w:rFonts w:ascii="Times New Roman" w:cs="Times New Roman" w:eastAsia="Times New Roman" w:hAnsi="Times New Roman"/>
-            <w:sz w:val="28"/>
-            <w:szCs w:val="28"/>
-            <w:u w:val="single"/>
-            <w:vertAlign w:val="superscript"/>
-            <w:rtl w:val="0"/>
-          </w:rPr>
-          <w:t xml:space="preserve">[40]</w:t>
-        </w:r>
-      </w:hyperlink>
-      <w:hyperlink w:anchor="shi4z2cblx1z">
-        <w:r>
-          <w:rPr>
-            <w:rFonts w:ascii="Times New Roman" w:cs="Times New Roman" w:eastAsia="Times New Roman" w:hAnsi="Times New Roman"/>
-            <w:sz w:val="28"/>
-            <w:szCs w:val="28"/>
-            <w:u w:val="single"/>
-            <w:vertAlign w:val="superscript"/>
-            <w:rtl w:val="0"/>
-          </w:rPr>
-          <w:t xml:space="preserve">[42]</w:t>
-        </w:r>
-      </w:hyperlink>
-      <w:hyperlink w:anchor="dyx2xar0adjf">
-        <w:r>
-          <w:rPr>
-            <w:rFonts w:ascii="Times New Roman" w:cs="Times New Roman" w:eastAsia="Times New Roman" w:hAnsi="Times New Roman"/>
-            <w:sz w:val="28"/>
-            <w:szCs w:val="28"/>
-            <w:u w:val="single"/>
-            <w:vertAlign w:val="superscript"/>
-            <w:rtl w:val="0"/>
-          </w:rPr>
-          <w:t xml:space="preserve">[39]</w:t>
-        </w:r>
-      </w:hyperlink>
-      <w:r>
-        <w:rPr>
-          <w:rtl w:val="0"/>
-        </w:rPr>
+        <w:t>Система реалізує RBAC з незалежними ролями та принципом мінімальних привілеїв. Вищі управлінські посади не успадковують операційні дозволи викладача, декана або адміністратора. Користувач може мати одну основну роль.[40][42][39]</w:t>
       </w:r>
     </w:p>
     <w:p>
@@ -6191,21 +5525,7 @@
               </w:rPr>
             </w:pPr>
             <w:r>
-              <w:rPr>
-                <w:rFonts w:ascii="Times New Roman" w:cs="Times New Roman" w:eastAsia="Times New Roman" w:hAnsi="Times New Roman"/>
-                <w:b w:val="1"/>
-                <w:bCs w:val="1"/>
-                <w:color w:val="000000"/>
-                <w:sz w:val="28"/>
-                <w:szCs w:val="28"/>
-                <w:rtl w:val="0"/>
-              </w:rPr>
-              <w:t xml:space="preserve">Права (спадкування від нижчих + нові)</w:t>
-            </w:r>
-            <w:r>
-              <w:rPr>
-                <w:rtl w:val="0"/>
-              </w:rPr>
+              <w:t>Явно призначені права без неявного успадкування</w:t>
             </w:r>
           </w:p>
         </w:tc>
@@ -6512,106 +5832,6 @@
                 <w:szCs w:val="28"/>
                 <w:rtl w:val="0"/>
               </w:rPr>
-              <w:t xml:space="preserve">Диспетчер розкладу</w:t>
-            </w:r>
-            <w:r>
-              <w:rPr>
-                <w:rtl w:val="0"/>
-              </w:rPr>
-            </w:r>
-          </w:p>
-        </w:tc>
-        <w:tc>
-          <w:tcPr/>
-          <w:p>
-            <w:pPr>
-              <w:rPr>
-                <w:rFonts w:ascii="Times New Roman" w:cs="Times New Roman" w:eastAsia="Times New Roman" w:hAnsi="Times New Roman"/>
-                <w:sz w:val="28"/>
-                <w:szCs w:val="28"/>
-              </w:rPr>
-            </w:pPr>
-            <w:r>
-              <w:rPr>
-                <w:rFonts w:ascii="Times New Roman" w:cs="Times New Roman" w:eastAsia="Times New Roman" w:hAnsi="Times New Roman"/>
-                <w:color w:val="000000"/>
-                <w:sz w:val="28"/>
-                <w:szCs w:val="28"/>
-                <w:rtl w:val="0"/>
-              </w:rPr>
-              <w:t xml:space="preserve">Права викладача + редагування розкладу, довідників (групи, аудиторії); read-only академічні дані.</w:t>
-            </w:r>
-            <w:r>
-              <w:rPr>
-                <w:rtl w:val="0"/>
-              </w:rPr>
-            </w:r>
-          </w:p>
-        </w:tc>
-        <w:tc>
-          <w:tcPr/>
-          <w:p>
-            <w:pPr>
-              <w:rPr>
-                <w:rFonts w:ascii="Times New Roman" w:cs="Times New Roman" w:eastAsia="Times New Roman" w:hAnsi="Times New Roman"/>
-                <w:sz w:val="28"/>
-                <w:szCs w:val="28"/>
-              </w:rPr>
-            </w:pPr>
-            <w:r>
-              <w:rPr>
-                <w:rFonts w:ascii="Times New Roman" w:cs="Times New Roman" w:eastAsia="Times New Roman" w:hAnsi="Times New Roman"/>
-                <w:color w:val="000000"/>
-                <w:sz w:val="28"/>
-                <w:szCs w:val="28"/>
-                <w:rtl w:val="0"/>
-              </w:rPr>
-              <w:t xml:space="preserve">Створення розкладу, перевірка конфліктів, експорт. </w:t>
-            </w:r>
-            <w:hyperlink w:anchor="eckwbfrbvwto">
-              <w:r>
-                <w:rPr>
-                  <w:rFonts w:ascii="Times New Roman" w:cs="Times New Roman" w:eastAsia="Times New Roman" w:hAnsi="Times New Roman"/>
-                  <w:sz w:val="28"/>
-                  <w:szCs w:val="28"/>
-                  <w:u w:val="single"/>
-                  <w:vertAlign w:val="superscript"/>
-                  <w:rtl w:val="0"/>
-                </w:rPr>
-                <w:t xml:space="preserve">[40]</w:t>
-              </w:r>
-            </w:hyperlink>
-            <w:r>
-              <w:rPr>
-                <w:rtl w:val="0"/>
-              </w:rPr>
-            </w:r>
-          </w:p>
-        </w:tc>
-      </w:tr>
-      <w:tr>
-        <w:trPr>
-          <w:cantSplit w:val="1"/>
-          <w:tblHeader w:val="0"/>
-        </w:trPr>
-        <w:tc>
-          <w:tcPr/>
-          <w:p>
-            <w:pPr>
-              <w:rPr>
-                <w:rFonts w:ascii="Times New Roman" w:cs="Times New Roman" w:eastAsia="Times New Roman" w:hAnsi="Times New Roman"/>
-                <w:sz w:val="28"/>
-                <w:szCs w:val="28"/>
-              </w:rPr>
-            </w:pPr>
-            <w:r>
-              <w:rPr>
-                <w:rFonts w:ascii="Times New Roman" w:cs="Times New Roman" w:eastAsia="Times New Roman" w:hAnsi="Times New Roman"/>
-                <w:color w:val="000000"/>
-                <w:sz w:val="28"/>
-                <w:szCs w:val="28"/>
-                <w:rtl w:val="0"/>
-              </w:rPr>
               <w:t xml:space="preserve">Завідувач кафедри</w:t>
             </w:r>
             <w:r>
@@ -6632,19 +5852,7 @@
               </w:rPr>
             </w:pPr>
             <w:r>
-              <w:rPr>
-                <w:rFonts w:ascii="Times New Roman" w:cs="Times New Roman" w:eastAsia="Times New Roman" w:hAnsi="Times New Roman"/>
-                <w:color w:val="000000"/>
-                <w:sz w:val="28"/>
-                <w:szCs w:val="28"/>
-                <w:rtl w:val="0"/>
-              </w:rPr>
-              <w:t xml:space="preserve">Права диспетчера + read-only по кафедрі (успішність, навантаження викладачів); звіти кафедри.</w:t>
-            </w:r>
-            <w:r>
-              <w:rPr>
-                <w:rtl w:val="0"/>
-              </w:rPr>
+              <w:t>Read-only дані своєї кафедри: успішність, відвідуваність, навантаження викладачів і кафедральні звіти.</w:t>
             </w:r>
           </w:p>
         </w:tc>
@@ -6745,19 +5953,7 @@
               </w:rPr>
             </w:pPr>
             <w:r>
-              <w:rPr>
-                <w:rFonts w:ascii="Times New Roman" w:cs="Times New Roman" w:eastAsia="Times New Roman" w:hAnsi="Times New Roman"/>
-                <w:color w:val="000000"/>
-                <w:sz w:val="28"/>
-                <w:szCs w:val="28"/>
-                <w:rtl w:val="0"/>
-              </w:rPr>
-              <w:t xml:space="preserve">Права завідувача + схвалення розкладів/відомостей; звіти факультету; моніторинг кафедр.</w:t>
-            </w:r>
-            <w:r>
-              <w:rPr>
-                <w:rtl w:val="0"/>
-              </w:rPr>
+              <w:t>Схвалення розкладів/відомостей, scoped-звіти факультету та моніторинг кафедр без системного адміністрування.</w:t>
             </w:r>
           </w:p>
         </w:tc>
@@ -6831,6 +6027,108 @@
               </w:rPr>
             </w:pPr>
             <w:r>
+              <w:t>Ректор</w:t>
+            </w:r>
+          </w:p>
+        </w:tc>
+        <w:tc>
+          <w:tcPr/>
+          <w:p>
+            <w:pPr>
+              <w:rPr>
+                <w:rFonts w:ascii="Times New Roman" w:cs="Times New Roman" w:eastAsia="Times New Roman" w:hAnsi="Times New Roman"/>
+                <w:sz w:val="28"/>
+                <w:szCs w:val="28"/>
+              </w:rPr>
+            </w:pPr>
+            <w:r>
+              <w:t>Глобальні агреговані звіти та результати опитувань у режимі read-only; без керування користувачами, розкладом або академічними записами.</w:t>
+            </w:r>
+          </w:p>
+        </w:tc>
+        <w:tc>
+          <w:tcPr/>
+          <w:p>
+            <w:pPr>
+              <w:rPr>
+                <w:rFonts w:ascii="Times New Roman" w:cs="Times New Roman" w:eastAsia="Times New Roman" w:hAnsi="Times New Roman"/>
+                <w:sz w:val="28"/>
+                <w:szCs w:val="28"/>
+              </w:rPr>
+            </w:pPr>
+            <w:r>
+              <w:t>Перегляд загальноакадемічних звітів і результатів опитувань.</w:t>
+            </w:r>
+          </w:p>
+        </w:tc>
+      </w:tr>
+      <w:tr>
+        <w:trPr>
+          <w:cantSplit w:val="1"/>
+          <w:tblHeader w:val="0"/>
+        </w:trPr>
+        <w:tc>
+          <w:tcPr/>
+          <w:p>
+            <w:pPr>
+              <w:rPr>
+                <w:rFonts w:ascii="Times New Roman" w:cs="Times New Roman" w:eastAsia="Times New Roman" w:hAnsi="Times New Roman"/>
+                <w:sz w:val="28"/>
+                <w:szCs w:val="28"/>
+              </w:rPr>
+            </w:pPr>
+            <w:r>
+              <w:t>Президент академії</w:t>
+            </w:r>
+          </w:p>
+        </w:tc>
+        <w:tc>
+          <w:tcPr/>
+          <w:p>
+            <w:pPr>
+              <w:rPr>
+                <w:rFonts w:ascii="Times New Roman" w:cs="Times New Roman" w:eastAsia="Times New Roman" w:hAnsi="Times New Roman"/>
+                <w:sz w:val="28"/>
+                <w:szCs w:val="28"/>
+              </w:rPr>
+            </w:pPr>
+            <w:r>
+              <w:t>Глобальні агреговані звіти та read-only пошук студентів за ПІБ; без mutation permissions.</w:t>
+            </w:r>
+          </w:p>
+        </w:tc>
+        <w:tc>
+          <w:tcPr/>
+          <w:p>
+            <w:pPr>
+              <w:rPr>
+                <w:rFonts w:ascii="Times New Roman" w:cs="Times New Roman" w:eastAsia="Times New Roman" w:hAnsi="Times New Roman"/>
+                <w:sz w:val="28"/>
+                <w:szCs w:val="28"/>
+              </w:rPr>
+            </w:pPr>
+            <w:r>
+              <w:t>Перегляд звітів і даних конкретного студента без редагування.</w:t>
+            </w:r>
+          </w:p>
+        </w:tc>
+      </w:tr>
+      <w:tr>
+        <w:trPr>
+          <w:cantSplit w:val="1"/>
+          <w:tblHeader w:val="0"/>
+        </w:trPr>
+        <w:tc>
+          <w:tcPr/>
+          <w:p>
+            <w:pPr>
+              <w:rPr>
+                <w:rFonts w:ascii="Times New Roman" w:cs="Times New Roman" w:eastAsia="Times New Roman" w:hAnsi="Times New Roman"/>
+                <w:sz w:val="28"/>
+                <w:szCs w:val="28"/>
+              </w:rPr>
+            </w:pPr>
+            <w:r>
               <w:rPr>
                 <w:rFonts w:ascii="Times New Roman" w:cs="Times New Roman" w:eastAsia="Times New Roman" w:hAnsi="Times New Roman"/>
                 <w:color w:val="000000"/>
@@ -6858,41 +6156,7 @@
               </w:rPr>
             </w:pPr>
             <w:r>
-              <w:rPr>
-                <w:rFonts w:ascii="Times New Roman" w:cs="Times New Roman" w:eastAsia="Times New Roman" w:hAnsi="Times New Roman"/>
-                <w:color w:val="000000"/>
-                <w:sz w:val="28"/>
-                <w:szCs w:val="28"/>
-                <w:rtl w:val="0"/>
-              </w:rPr>
-              <w:t xml:space="preserve">Повний доступ до налаштувань, користувачів, ролей, логів; </w:t>
-            </w:r>
-            <w:r>
-              <w:rPr>
-                <w:rFonts w:ascii="Times New Roman" w:cs="Times New Roman" w:eastAsia="Times New Roman" w:hAnsi="Times New Roman"/>
-                <w:i w:val="1"/>
-                <w:iCs w:val="1"/>
-                <w:color w:val="000000"/>
-                <w:sz w:val="28"/>
-                <w:szCs w:val="28"/>
-                <w:rtl w:val="0"/>
-              </w:rPr>
-              <w:t xml:space="preserve">без</w:t>
-            </w:r>
-            <w:r>
-              <w:rPr>
-                <w:rFonts w:ascii="Times New Roman" w:cs="Times New Roman" w:eastAsia="Times New Roman" w:hAnsi="Times New Roman"/>
-                <w:color w:val="000000"/>
-                <w:sz w:val="28"/>
-                <w:szCs w:val="28"/>
-                <w:rtl w:val="0"/>
-              </w:rPr>
-              <w:t xml:space="preserve"> академічних змін (оцінки, розклад).</w:t>
-            </w:r>
-            <w:r>
-              <w:rPr>
-                <w:rtl w:val="0"/>
-              </w:rPr>
+              <w:t>Системні налаштування, користувачі, ролі, аудит, довідники та повне керування розкладом.</w:t>
             </w:r>
           </w:p>
         </w:tc>
@@ -7013,32 +6277,7 @@
         </w:rPr>
       </w:pPr>
       <w:r>
-        <w:rPr>
-          <w:rFonts w:ascii="Times New Roman" w:cs="Times New Roman" w:eastAsia="Times New Roman" w:hAnsi="Times New Roman"/>
-          <w:color w:val="000000"/>
-          <w:sz w:val="28"/>
-          <w:szCs w:val="28"/>
-          <w:rtl w:val="0"/>
-        </w:rPr>
-        <w:t xml:space="preserve">Role assignment: Користувач активує роль при вході.</w:t>
-      </w:r>
-      <w:hyperlink w:anchor="shi4z2cblx1z">
-        <w:r>
-          <w:rPr>
-            <w:rFonts w:ascii="Times New Roman" w:cs="Times New Roman" w:eastAsia="Times New Roman" w:hAnsi="Times New Roman"/>
-            <w:sz w:val="28"/>
-            <w:szCs w:val="28"/>
-            <w:u w:val="single"/>
-            <w:vertAlign w:val="superscript"/>
-            <w:rtl w:val="0"/>
-          </w:rPr>
-          <w:t xml:space="preserve">[42]</w:t>
-        </w:r>
-      </w:hyperlink>
-      <w:r>
-        <w:rPr>
-          <w:rtl w:val="0"/>
-        </w:rPr>
+        <w:t>Role assignment: Користувач працює з однією основною роллю, призначеною адміністратором.[42]</w:t>
       </w:r>
     </w:p>
     <w:p>
@@ -7164,49 +6403,7 @@
         </w:rPr>
       </w:pPr>
       <w:r>
-        <w:rPr>
-          <w:rFonts w:ascii="Times New Roman" w:cs="Times New Roman" w:eastAsia="Times New Roman" w:hAnsi="Times New Roman"/>
-          <w:color w:val="000000"/>
-          <w:sz w:val="28"/>
-          <w:szCs w:val="28"/>
-          <w:rtl w:val="0"/>
-        </w:rPr>
-        <w:t xml:space="preserve">Ієрархія: Вищі ролі успадковують нижчі (наприклад, декан бачить усе по факультету).</w:t>
-      </w:r>
-      <w:bookmarkStart w:colFirst="0" w:colLast="0" w:name="t2o07itucl66" w:id="135"/>
-      <w:bookmarkEnd w:id="135"/>
-      <w:hyperlink w:anchor="dyx2xar0adjf">
-        <w:r>
-          <w:rPr>
-            <w:rFonts w:ascii="Times New Roman" w:cs="Times New Roman" w:eastAsia="Times New Roman" w:hAnsi="Times New Roman"/>
-            <w:sz w:val="28"/>
-            <w:szCs w:val="28"/>
-            <w:u w:val="single"/>
-            <w:vertAlign w:val="superscript"/>
-            <w:rtl w:val="0"/>
-          </w:rPr>
-          <w:t xml:space="preserve">[39]</w:t>
-        </w:r>
-      </w:hyperlink>
-      <w:bookmarkStart w:colFirst="0" w:colLast="0" w:name="1bat0ay8uy3w" w:id="136"/>
-      <w:bookmarkEnd w:id="136"/>
-      <w:hyperlink w:anchor="eckwbfrbvwto">
-        <w:r>
-          <w:rPr>
-            <w:rFonts w:ascii="Times New Roman" w:cs="Times New Roman" w:eastAsia="Times New Roman" w:hAnsi="Times New Roman"/>
-            <w:sz w:val="28"/>
-            <w:szCs w:val="28"/>
-            <w:u w:val="single"/>
-            <w:vertAlign w:val="superscript"/>
-            <w:rtl w:val="0"/>
-          </w:rPr>
-          <w:t xml:space="preserve">[40]</w:t>
-        </w:r>
-      </w:hyperlink>
-      <w:r>
-        <w:rPr>
-          <w:rtl w:val="0"/>
-        </w:rPr>
+        <w:t>Незалежність ролей: вищі посади не успадковують операційні дозволи нижчих ролей; кожна дія дозволяється явно та перевіряється у відповідному scope.[39][40]</w:t>
       </w:r>
     </w:p>
     <w:p>

</xml_diff>